<commit_message>
Corrige referencia residual a MySQL en el SRS y registra el cambio en el informe de cambios
</commit_message>
<xml_diff>
--- a/public/anexos/10-Trazabilidad/Informe_de_Cambios_ALMEXA.docx
+++ b/public/anexos/10-Trazabilidad/Informe_de_Cambios_ALMEXA.docx
@@ -490,6 +490,50 @@
                 <w:szCs w:val="18"/>
               </w:rPr>
               <w:t>Alineación con el SRS y con el diagrama de dominio del proyecto.</w:t>
+            </w:r>
+          </w:p>
+        </w:tc>
+      </w:tr>
+      <w:tr>
+        <w:tc>
+          <w:tcPr>
+            <w:tcW w:type="dxa" w:w="1657"/>
+          </w:tcPr>
+          <w:p>
+            <w:r>
+              <w:rPr>
+                <w:rFonts w:ascii="Calibri" w:hAnsi="Calibri"/>
+                <w:sz w:val="20"/>
+              </w:rPr>
+              <w:t>Kevin SRS-Sistema de Inventario_CORREGIDO.docx (tabla de requisitos de infraestructura del servidor)</w:t>
+            </w:r>
+          </w:p>
+        </w:tc>
+        <w:tc>
+          <w:tcPr>
+            <w:tcW w:type="dxa" w:w="4255"/>
+          </w:tcPr>
+          <w:p>
+            <w:r>
+              <w:rPr>
+                <w:rFonts w:ascii="Calibri" w:hAnsi="Calibri"/>
+                <w:sz w:val="20"/>
+              </w:rPr>
+              <w:t>Se sustituyó 'PostgreSQL o MySQL' por 'PostgreSQL' como base de datos del servidor de producción.</w:t>
+            </w:r>
+          </w:p>
+        </w:tc>
+        <w:tc>
+          <w:tcPr>
+            <w:tcW w:type="dxa" w:w="3088"/>
+          </w:tcPr>
+          <w:p>
+            <w:r>
+              <w:rPr>
+                <w:rFonts w:ascii="Calibri" w:hAnsi="Calibri"/>
+                <w:sz w:val="20"/>
+              </w:rPr>
+              <w:t>Eliminar la última referencia residual a MySQL y dejar el SRS con PostgreSQL como único motor, coherente con el resto de la documentación.</w:t>
             </w:r>
           </w:p>
         </w:tc>

</xml_diff>